<commit_message>
template content fixed [for one]
</commit_message>
<xml_diff>
--- a/public/templates/Bon de Paiement Frais d'agence.docx
+++ b/public/templates/Bon de Paiement Frais d'agence.docx
@@ -1,56 +1,65 @@
 
 <file path=word/document.xml><?xml version="1.0" encoding="utf-8"?>
-<w:document xmlns:wpc="http://schemas.microsoft.com/office/word/2010/wordprocessingCanvas" xmlns:cx="http://schemas.microsoft.com/office/drawing/2014/chartex" xmlns:mc="http://schemas.openxmlformats.org/markup-compatibility/2006" xmlns:o="urn:schemas-microsoft-com:office:office" xmlns:r="http://schemas.openxmlformats.org/officeDocument/2006/relationships" xmlns:m="http://schemas.openxmlformats.org/officeDocument/2006/math" xmlns:v="urn:schemas-microsoft-com:vml" xmlns:wp14="http://schemas.microsoft.com/office/word/2010/wordprocessingDrawing" xmlns:wp="http://schemas.openxmlformats.org/drawingml/2006/wordprocessingDrawing" xmlns:w10="urn:schemas-microsoft-com:office:word" xmlns:w="http://schemas.openxmlformats.org/wordprocessingml/2006/main" xmlns:w14="http://schemas.microsoft.com/office/word/2010/wordml" xmlns:w15="http://schemas.microsoft.com/office/word/2012/wordml" xmlns:w16se="http://schemas.microsoft.com/office/word/2015/wordml/symex" xmlns:wpg="http://schemas.microsoft.com/office/word/2010/wordprocessingGroup" xmlns:wpi="http://schemas.microsoft.com/office/word/2010/wordprocessingInk" xmlns:wne="http://schemas.microsoft.com/office/word/2006/wordml" xmlns:wps="http://schemas.microsoft.com/office/word/2010/wordprocessingShape" mc:Ignorable="w14 w15 w16se wp14">
+<w:document xmlns:wpc="http://schemas.microsoft.com/office/word/2010/wordprocessingCanvas" xmlns:cx="http://schemas.microsoft.com/office/drawing/2014/chartex" xmlns:cx1="http://schemas.microsoft.com/office/drawing/2015/9/8/chartex" xmlns:cx2="http://schemas.microsoft.com/office/drawing/2015/10/21/chartex" xmlns:cx3="http://schemas.microsoft.com/office/drawing/2016/5/9/chartex" xmlns:cx4="http://schemas.microsoft.com/office/drawing/2016/5/10/chartex" xmlns:cx5="http://schemas.microsoft.com/office/drawing/2016/5/11/chartex" xmlns:cx6="http://schemas.microsoft.com/office/drawing/2016/5/12/chartex" xmlns:cx7="http://schemas.microsoft.com/office/drawing/2016/5/13/chartex" xmlns:cx8="http://schemas.microsoft.com/office/drawing/2016/5/14/chartex" xmlns:mc="http://schemas.openxmlformats.org/markup-compatibility/2006" xmlns:aink="http://schemas.microsoft.com/office/drawing/2016/ink" xmlns:am3d="http://schemas.microsoft.com/office/drawing/2017/model3d" xmlns:o="urn:schemas-microsoft-com:office:office" xmlns:oel="http://schemas.microsoft.com/office/2019/extlst" xmlns:r="http://schemas.openxmlformats.org/officeDocument/2006/relationships" xmlns:m="http://schemas.openxmlformats.org/officeDocument/2006/math" xmlns:v="urn:schemas-microsoft-com:vml" xmlns:wp14="http://schemas.microsoft.com/office/word/2010/wordprocessingDrawing" xmlns:wp="http://schemas.openxmlformats.org/drawingml/2006/wordprocessingDrawing" xmlns:w10="urn:schemas-microsoft-com:office:word" xmlns:w="http://schemas.openxmlformats.org/wordprocessingml/2006/main" xmlns:w14="http://schemas.microsoft.com/office/word/2010/wordml" xmlns:w15="http://schemas.microsoft.com/office/word/2012/wordml" xmlns:w16cex="http://schemas.microsoft.com/office/word/2018/wordml/cex" xmlns:w16cid="http://schemas.microsoft.com/office/word/2016/wordml/cid" xmlns:w16="http://schemas.microsoft.com/office/word/2018/wordml" xmlns:w16sdtdh="http://schemas.microsoft.com/office/word/2020/wordml/sdtdatahash" xmlns:w16se="http://schemas.microsoft.com/office/word/2015/wordml/symex" xmlns:wpg="http://schemas.microsoft.com/office/word/2010/wordprocessingGroup" xmlns:wpi="http://schemas.microsoft.com/office/word/2010/wordprocessingInk" xmlns:wne="http://schemas.microsoft.com/office/word/2006/wordml" xmlns:wps="http://schemas.microsoft.com/office/word/2010/wordprocessingShape" mc:Ignorable="w14 w15 w16se w16cid w16 w16cex w16sdtdh wp14">
   <w:body>
     <w:p>
       <w:r>
         <w:t xml:space="preserve">           </w:t>
       </w:r>
-      <w:bookmarkStart w:id="0" w:name="_GoBack"/>
-      <w:bookmarkEnd w:id="0"/>
     </w:p>
     <w:p/>
     <w:p>
       <w:pPr>
-        <w:jc w:val="center"/>
+        <w:pStyle w:val="Title"/>
         <w:rPr>
+          <w:rFonts w:asciiTheme="majorBidi" w:hAnsiTheme="majorBidi"/>
           <w:b/>
-          <w:sz w:val="36"/>
-          <w:szCs w:val="36"/>
+          <w:bCs/>
         </w:rPr>
       </w:pPr>
       <w:r>
         <w:rPr>
+          <w:rFonts w:asciiTheme="majorBidi" w:hAnsiTheme="majorBidi"/>
           <w:b/>
-          <w:sz w:val="36"/>
-          <w:szCs w:val="36"/>
+          <w:bCs/>
         </w:rPr>
         <w:t>Bon de Paiement pour les</w:t>
       </w:r>
       <w:r>
         <w:rPr>
+          <w:rFonts w:asciiTheme="majorBidi" w:hAnsiTheme="majorBidi"/>
           <w:b/>
-          <w:sz w:val="36"/>
-          <w:szCs w:val="36"/>
+          <w:bCs/>
         </w:rPr>
         <w:t xml:space="preserve"> Frais d'Agence</w:t>
       </w:r>
     </w:p>
-    <w:p>
-      <w:pPr>
-        <w:rPr>
-          <w:b/>
-          <w:sz w:val="28"/>
-          <w:szCs w:val="28"/>
-        </w:rPr>
-      </w:pPr>
+    <w:p/>
+    <w:p>
+      <w:r>
+        <w:t xml:space="preserve">Reference : </w:t>
+      </w:r>
+      <w:r>
+        <w:t>{{RECEIPT_NUMBER}}</w:t>
+      </w:r>
+    </w:p>
+    <w:p>
+      <w:r>
+        <w:t xml:space="preserve">Date : </w:t>
+      </w:r>
+      <w:r>
+        <w:t>{{DATE}}</w:t>
+      </w:r>
     </w:p>
     <w:p>
       <w:r>
         <w:t>Nom et Prénom du Client :</w:t>
       </w:r>
       <w:r>
-        <w:t xml:space="preserve"> BELABESS</w:t>
+        <w:t xml:space="preserve"> </w:t>
+      </w:r>
+      <w:r>
+        <w:t>{{CLIENT_NAME}}</w:t>
       </w:r>
     </w:p>
     <w:p>
@@ -58,7 +67,7 @@
         <w:t xml:space="preserve">Numéro CNI : </w:t>
       </w:r>
       <w:r>
-        <w:t>AUKACHA</w:t>
+        <w:t>/</w:t>
       </w:r>
     </w:p>
     <w:p>
@@ -68,21 +77,8 @@
       <w:r>
         <w:t xml:space="preserve">: </w:t>
       </w:r>
-      <w:proofErr w:type="spellStart"/>
-      <w:r>
-        <w:t>Aîn</w:t>
-      </w:r>
-      <w:proofErr w:type="spellEnd"/>
-      <w:r>
-        <w:t xml:space="preserve"> El </w:t>
-      </w:r>
-      <w:proofErr w:type="spellStart"/>
-      <w:r>
-        <w:t>Turck</w:t>
-      </w:r>
-      <w:proofErr w:type="spellEnd"/>
-      <w:r>
-        <w:t xml:space="preserve"> - Oran</w:t>
+      <w:r>
+        <w:t>{{PROPERTY_ADDRESS}}</w:t>
       </w:r>
     </w:p>
     <w:p>
@@ -90,26 +86,39 @@
         <w:t>Télé</w:t>
       </w:r>
       <w:r>
-        <w:t>phone : 0558873599</w:t>
+        <w:t xml:space="preserve">phone : </w:t>
+      </w:r>
+      <w:r>
+        <w:t>{{CLIENT_PHONE}}</w:t>
       </w:r>
     </w:p>
     <w:p/>
     <w:p>
       <w:r>
-        <w:t>Type d’appartement : F</w:t>
-      </w:r>
-      <w:proofErr w:type="gramStart"/>
-      <w:r>
-        <w:t>4  de</w:t>
-      </w:r>
-      <w:proofErr w:type="gramEnd"/>
-      <w:r>
-        <w:t xml:space="preserve"> 133m2 </w:t>
-      </w:r>
-    </w:p>
-    <w:p>
-      <w:r>
-        <w:t>Prix : 16000000 DA</w:t>
+        <w:t xml:space="preserve">Agent : </w:t>
+      </w:r>
+      <w:r>
+        <w:t>{{AGENT_NAME}}</w:t>
+      </w:r>
+    </w:p>
+    <w:p/>
+    <w:p>
+      <w:r>
+        <w:t>Type d’appartement :</w:t>
+      </w:r>
+      <w:r>
+        <w:t xml:space="preserve"> </w:t>
+      </w:r>
+      <w:r>
+        <w:t>{{PROPERTY_TYPE}}</w:t>
+      </w:r>
+    </w:p>
+    <w:p>
+      <w:r>
+        <w:t xml:space="preserve">Prix : </w:t>
+      </w:r>
+      <w:r>
+        <w:t>{{AMOUNT_WORDS}}</w:t>
       </w:r>
     </w:p>
     <w:p/>
@@ -128,7 +137,7 @@
     </w:p>
     <w:tbl>
       <w:tblPr>
-        <w:tblStyle w:val="Grilledutableau"/>
+        <w:tblStyle w:val="TableGrid"/>
         <w:tblW w:w="0" w:type="auto"/>
         <w:tblLook w:val="04A0" w:firstRow="1" w:lastRow="0" w:firstColumn="1" w:lastColumn="0" w:noHBand="0" w:noVBand="1"/>
       </w:tblPr>
@@ -193,7 +202,13 @@
               <w:jc w:val="center"/>
             </w:pPr>
             <w:r>
-              <w:t>160000 DA</w:t>
+              <w:t>{{</w:t>
+            </w:r>
+            <w:r>
+              <w:t>AMOUNT</w:t>
+            </w:r>
+            <w:r>
+              <w:t>}}</w:t>
             </w:r>
           </w:p>
         </w:tc>
@@ -201,6 +216,11 @@
     </w:tbl>
     <w:p/>
     <w:p>
+      <w:pPr>
+        <w:rPr>
+          <w:lang w:val="en-DZ"/>
+        </w:rPr>
+      </w:pPr>
       <w:r>
         <w:rPr>
           <w:b/>
@@ -208,7 +228,10 @@
         <w:t>Mode de Paiement :</w:t>
       </w:r>
       <w:r>
-        <w:t xml:space="preserve"> Cash </w:t>
+        <w:t xml:space="preserve"> </w:t>
+      </w:r>
+      <w:r>
+        <w:t>{{PAYMENT_METHOD}}</w:t>
       </w:r>
     </w:p>
     <w:p/>
@@ -247,7 +270,7 @@
 </file>
 
 <file path=word/endnotes.xml><?xml version="1.0" encoding="utf-8"?>
-<w:endnotes xmlns:wpc="http://schemas.microsoft.com/office/word/2010/wordprocessingCanvas" xmlns:cx="http://schemas.microsoft.com/office/drawing/2014/chartex" xmlns:mc="http://schemas.openxmlformats.org/markup-compatibility/2006" xmlns:o="urn:schemas-microsoft-com:office:office" xmlns:r="http://schemas.openxmlformats.org/officeDocument/2006/relationships" xmlns:m="http://schemas.openxmlformats.org/officeDocument/2006/math" xmlns:v="urn:schemas-microsoft-com:vml" xmlns:wp14="http://schemas.microsoft.com/office/word/2010/wordprocessingDrawing" xmlns:wp="http://schemas.openxmlformats.org/drawingml/2006/wordprocessingDrawing" xmlns:w10="urn:schemas-microsoft-com:office:word" xmlns:w="http://schemas.openxmlformats.org/wordprocessingml/2006/main" xmlns:w14="http://schemas.microsoft.com/office/word/2010/wordml" xmlns:w15="http://schemas.microsoft.com/office/word/2012/wordml" xmlns:w16se="http://schemas.microsoft.com/office/word/2015/wordml/symex" xmlns:wpg="http://schemas.microsoft.com/office/word/2010/wordprocessingGroup" xmlns:wpi="http://schemas.microsoft.com/office/word/2010/wordprocessingInk" xmlns:wne="http://schemas.microsoft.com/office/word/2006/wordml" xmlns:wps="http://schemas.microsoft.com/office/word/2010/wordprocessingShape" mc:Ignorable="w14 w15 w16se wp14">
+<w:endnotes xmlns:wpc="http://schemas.microsoft.com/office/word/2010/wordprocessingCanvas" xmlns:cx="http://schemas.microsoft.com/office/drawing/2014/chartex" xmlns:cx1="http://schemas.microsoft.com/office/drawing/2015/9/8/chartex" xmlns:cx2="http://schemas.microsoft.com/office/drawing/2015/10/21/chartex" xmlns:cx3="http://schemas.microsoft.com/office/drawing/2016/5/9/chartex" xmlns:cx4="http://schemas.microsoft.com/office/drawing/2016/5/10/chartex" xmlns:cx5="http://schemas.microsoft.com/office/drawing/2016/5/11/chartex" xmlns:cx6="http://schemas.microsoft.com/office/drawing/2016/5/12/chartex" xmlns:cx7="http://schemas.microsoft.com/office/drawing/2016/5/13/chartex" xmlns:cx8="http://schemas.microsoft.com/office/drawing/2016/5/14/chartex" xmlns:mc="http://schemas.openxmlformats.org/markup-compatibility/2006" xmlns:aink="http://schemas.microsoft.com/office/drawing/2016/ink" xmlns:am3d="http://schemas.microsoft.com/office/drawing/2017/model3d" xmlns:o="urn:schemas-microsoft-com:office:office" xmlns:oel="http://schemas.microsoft.com/office/2019/extlst" xmlns:r="http://schemas.openxmlformats.org/officeDocument/2006/relationships" xmlns:m="http://schemas.openxmlformats.org/officeDocument/2006/math" xmlns:v="urn:schemas-microsoft-com:vml" xmlns:wp14="http://schemas.microsoft.com/office/word/2010/wordprocessingDrawing" xmlns:wp="http://schemas.openxmlformats.org/drawingml/2006/wordprocessingDrawing" xmlns:w10="urn:schemas-microsoft-com:office:word" xmlns:w="http://schemas.openxmlformats.org/wordprocessingml/2006/main" xmlns:w14="http://schemas.microsoft.com/office/word/2010/wordml" xmlns:w15="http://schemas.microsoft.com/office/word/2012/wordml" xmlns:w16cex="http://schemas.microsoft.com/office/word/2018/wordml/cex" xmlns:w16cid="http://schemas.microsoft.com/office/word/2016/wordml/cid" xmlns:w16="http://schemas.microsoft.com/office/word/2018/wordml" xmlns:w16sdtdh="http://schemas.microsoft.com/office/word/2020/wordml/sdtdatahash" xmlns:w16se="http://schemas.microsoft.com/office/word/2015/wordml/symex" xmlns:wpg="http://schemas.microsoft.com/office/word/2010/wordprocessingGroup" xmlns:wpi="http://schemas.microsoft.com/office/word/2010/wordprocessingInk" xmlns:wne="http://schemas.microsoft.com/office/word/2006/wordml" xmlns:wps="http://schemas.microsoft.com/office/word/2010/wordprocessingShape" mc:Ignorable="w14 w15 w16se w16cid w16 w16cex w16sdtdh wp14">
   <w:endnote w:type="separator" w:id="-1">
     <w:p>
       <w:pPr>
@@ -272,7 +295,7 @@
 </file>
 
 <file path=word/footnotes.xml><?xml version="1.0" encoding="utf-8"?>
-<w:footnotes xmlns:wpc="http://schemas.microsoft.com/office/word/2010/wordprocessingCanvas" xmlns:cx="http://schemas.microsoft.com/office/drawing/2014/chartex" xmlns:mc="http://schemas.openxmlformats.org/markup-compatibility/2006" xmlns:o="urn:schemas-microsoft-com:office:office" xmlns:r="http://schemas.openxmlformats.org/officeDocument/2006/relationships" xmlns:m="http://schemas.openxmlformats.org/officeDocument/2006/math" xmlns:v="urn:schemas-microsoft-com:vml" xmlns:wp14="http://schemas.microsoft.com/office/word/2010/wordprocessingDrawing" xmlns:wp="http://schemas.openxmlformats.org/drawingml/2006/wordprocessingDrawing" xmlns:w10="urn:schemas-microsoft-com:office:word" xmlns:w="http://schemas.openxmlformats.org/wordprocessingml/2006/main" xmlns:w14="http://schemas.microsoft.com/office/word/2010/wordml" xmlns:w15="http://schemas.microsoft.com/office/word/2012/wordml" xmlns:w16se="http://schemas.microsoft.com/office/word/2015/wordml/symex" xmlns:wpg="http://schemas.microsoft.com/office/word/2010/wordprocessingGroup" xmlns:wpi="http://schemas.microsoft.com/office/word/2010/wordprocessingInk" xmlns:wne="http://schemas.microsoft.com/office/word/2006/wordml" xmlns:wps="http://schemas.microsoft.com/office/word/2010/wordprocessingShape" mc:Ignorable="w14 w15 w16se wp14">
+<w:footnotes xmlns:wpc="http://schemas.microsoft.com/office/word/2010/wordprocessingCanvas" xmlns:cx="http://schemas.microsoft.com/office/drawing/2014/chartex" xmlns:cx1="http://schemas.microsoft.com/office/drawing/2015/9/8/chartex" xmlns:cx2="http://schemas.microsoft.com/office/drawing/2015/10/21/chartex" xmlns:cx3="http://schemas.microsoft.com/office/drawing/2016/5/9/chartex" xmlns:cx4="http://schemas.microsoft.com/office/drawing/2016/5/10/chartex" xmlns:cx5="http://schemas.microsoft.com/office/drawing/2016/5/11/chartex" xmlns:cx6="http://schemas.microsoft.com/office/drawing/2016/5/12/chartex" xmlns:cx7="http://schemas.microsoft.com/office/drawing/2016/5/13/chartex" xmlns:cx8="http://schemas.microsoft.com/office/drawing/2016/5/14/chartex" xmlns:mc="http://schemas.openxmlformats.org/markup-compatibility/2006" xmlns:aink="http://schemas.microsoft.com/office/drawing/2016/ink" xmlns:am3d="http://schemas.microsoft.com/office/drawing/2017/model3d" xmlns:o="urn:schemas-microsoft-com:office:office" xmlns:oel="http://schemas.microsoft.com/office/2019/extlst" xmlns:r="http://schemas.openxmlformats.org/officeDocument/2006/relationships" xmlns:m="http://schemas.openxmlformats.org/officeDocument/2006/math" xmlns:v="urn:schemas-microsoft-com:vml" xmlns:wp14="http://schemas.microsoft.com/office/word/2010/wordprocessingDrawing" xmlns:wp="http://schemas.openxmlformats.org/drawingml/2006/wordprocessingDrawing" xmlns:w10="urn:schemas-microsoft-com:office:word" xmlns:w="http://schemas.openxmlformats.org/wordprocessingml/2006/main" xmlns:w14="http://schemas.microsoft.com/office/word/2010/wordml" xmlns:w15="http://schemas.microsoft.com/office/word/2012/wordml" xmlns:w16cex="http://schemas.microsoft.com/office/word/2018/wordml/cex" xmlns:w16cid="http://schemas.microsoft.com/office/word/2016/wordml/cid" xmlns:w16="http://schemas.microsoft.com/office/word/2018/wordml" xmlns:w16sdtdh="http://schemas.microsoft.com/office/word/2020/wordml/sdtdatahash" xmlns:w16se="http://schemas.microsoft.com/office/word/2015/wordml/symex" xmlns:wpg="http://schemas.microsoft.com/office/word/2010/wordprocessingGroup" xmlns:wpi="http://schemas.microsoft.com/office/word/2010/wordprocessingInk" xmlns:wne="http://schemas.microsoft.com/office/word/2006/wordml" xmlns:wps="http://schemas.microsoft.com/office/word/2010/wordprocessingShape" mc:Ignorable="w14 w15 w16se w16cid w16 w16cex w16sdtdh wp14">
   <w:footnote w:type="separator" w:id="-1">
     <w:p>
       <w:pPr>
@@ -297,30 +320,28 @@
 </file>
 
 <file path=word/header1.xml><?xml version="1.0" encoding="utf-8"?>
-<w:hdr xmlns:wpc="http://schemas.microsoft.com/office/word/2010/wordprocessingCanvas" xmlns:cx="http://schemas.microsoft.com/office/drawing/2014/chartex" xmlns:mc="http://schemas.openxmlformats.org/markup-compatibility/2006" xmlns:o="urn:schemas-microsoft-com:office:office" xmlns:r="http://schemas.openxmlformats.org/officeDocument/2006/relationships" xmlns:m="http://schemas.openxmlformats.org/officeDocument/2006/math" xmlns:v="urn:schemas-microsoft-com:vml" xmlns:wp14="http://schemas.microsoft.com/office/word/2010/wordprocessingDrawing" xmlns:wp="http://schemas.openxmlformats.org/drawingml/2006/wordprocessingDrawing" xmlns:w10="urn:schemas-microsoft-com:office:word" xmlns:w="http://schemas.openxmlformats.org/wordprocessingml/2006/main" xmlns:w14="http://schemas.microsoft.com/office/word/2010/wordml" xmlns:w15="http://schemas.microsoft.com/office/word/2012/wordml" xmlns:w16se="http://schemas.microsoft.com/office/word/2015/wordml/symex" xmlns:wpg="http://schemas.microsoft.com/office/word/2010/wordprocessingGroup" xmlns:wpi="http://schemas.microsoft.com/office/word/2010/wordprocessingInk" xmlns:wne="http://schemas.microsoft.com/office/word/2006/wordml" xmlns:wps="http://schemas.microsoft.com/office/word/2010/wordprocessingShape" mc:Ignorable="w14 w15 w16se wp14">
+<w:hdr xmlns:wpc="http://schemas.microsoft.com/office/word/2010/wordprocessingCanvas" xmlns:cx="http://schemas.microsoft.com/office/drawing/2014/chartex" xmlns:cx1="http://schemas.microsoft.com/office/drawing/2015/9/8/chartex" xmlns:cx2="http://schemas.microsoft.com/office/drawing/2015/10/21/chartex" xmlns:cx3="http://schemas.microsoft.com/office/drawing/2016/5/9/chartex" xmlns:cx4="http://schemas.microsoft.com/office/drawing/2016/5/10/chartex" xmlns:cx5="http://schemas.microsoft.com/office/drawing/2016/5/11/chartex" xmlns:cx6="http://schemas.microsoft.com/office/drawing/2016/5/12/chartex" xmlns:cx7="http://schemas.microsoft.com/office/drawing/2016/5/13/chartex" xmlns:cx8="http://schemas.microsoft.com/office/drawing/2016/5/14/chartex" xmlns:mc="http://schemas.openxmlformats.org/markup-compatibility/2006" xmlns:aink="http://schemas.microsoft.com/office/drawing/2016/ink" xmlns:am3d="http://schemas.microsoft.com/office/drawing/2017/model3d" xmlns:o="urn:schemas-microsoft-com:office:office" xmlns:oel="http://schemas.microsoft.com/office/2019/extlst" xmlns:r="http://schemas.openxmlformats.org/officeDocument/2006/relationships" xmlns:m="http://schemas.openxmlformats.org/officeDocument/2006/math" xmlns:v="urn:schemas-microsoft-com:vml" xmlns:wp14="http://schemas.microsoft.com/office/word/2010/wordprocessingDrawing" xmlns:wp="http://schemas.openxmlformats.org/drawingml/2006/wordprocessingDrawing" xmlns:w10="urn:schemas-microsoft-com:office:word" xmlns:w="http://schemas.openxmlformats.org/wordprocessingml/2006/main" xmlns:w14="http://schemas.microsoft.com/office/word/2010/wordml" xmlns:w15="http://schemas.microsoft.com/office/word/2012/wordml" xmlns:w16cex="http://schemas.microsoft.com/office/word/2018/wordml/cex" xmlns:w16cid="http://schemas.microsoft.com/office/word/2016/wordml/cid" xmlns:w16="http://schemas.microsoft.com/office/word/2018/wordml" xmlns:w16sdtdh="http://schemas.microsoft.com/office/word/2020/wordml/sdtdatahash" xmlns:w16se="http://schemas.microsoft.com/office/word/2015/wordml/symex" xmlns:wpg="http://schemas.microsoft.com/office/word/2010/wordprocessingGroup" xmlns:wpi="http://schemas.microsoft.com/office/word/2010/wordprocessingInk" xmlns:wne="http://schemas.microsoft.com/office/word/2006/wordml" xmlns:wps="http://schemas.microsoft.com/office/word/2010/wordprocessingShape" mc:Ignorable="w14 w15 w16se w16cid w16 w16cex w16sdtdh wp14">
   <w:p>
     <w:pPr>
-      <w:pStyle w:val="En-tte"/>
+      <w:pStyle w:val="Header"/>
     </w:pPr>
     <w:r>
       <w:rPr>
         <w:noProof/>
-        <w:sz w:val="72"/>
-        <w:lang w:eastAsia="fr-FR"/>
       </w:rPr>
       <w:drawing>
-        <wp:anchor distT="0" distB="0" distL="114300" distR="114300" simplePos="0" relativeHeight="251659264" behindDoc="1" locked="0" layoutInCell="1" allowOverlap="1" wp14:anchorId="3C624ABD" wp14:editId="21DA17B8">
+        <wp:anchor distT="0" distB="0" distL="114300" distR="114300" simplePos="0" relativeHeight="251659264" behindDoc="0" locked="0" layoutInCell="1" allowOverlap="1">
           <wp:simplePos x="0" y="0"/>
-          <wp:positionH relativeFrom="page">
-            <wp:align>left</wp:align>
+          <wp:positionH relativeFrom="column">
+            <wp:posOffset>-172427</wp:posOffset>
           </wp:positionH>
           <wp:positionV relativeFrom="paragraph">
-            <wp:posOffset>-449580</wp:posOffset>
+            <wp:posOffset>-69361</wp:posOffset>
           </wp:positionV>
-          <wp:extent cx="1774190" cy="1657985"/>
+          <wp:extent cx="3292884" cy="773723"/>
           <wp:effectExtent l="0" t="0" r="0" b="0"/>
-          <wp:wrapSquare wrapText="bothSides"/>
-          <wp:docPr id="2" name="Image 2"/>
+          <wp:wrapNone/>
+          <wp:docPr id="1759897493" name="Graphic 1"/>
           <wp:cNvGraphicFramePr>
             <a:graphicFrameLocks xmlns:a="http://schemas.openxmlformats.org/drawingml/2006/main" noChangeAspect="1"/>
           </wp:cNvGraphicFramePr>
@@ -328,10 +349,8 @@
             <a:graphicData uri="http://schemas.openxmlformats.org/drawingml/2006/picture">
               <pic:pic xmlns:pic="http://schemas.openxmlformats.org/drawingml/2006/picture">
                 <pic:nvPicPr>
-                  <pic:cNvPr id="0" name="Picture 1"/>
-                  <pic:cNvPicPr>
-                    <a:picLocks noChangeAspect="1" noChangeArrowheads="1"/>
-                  </pic:cNvPicPr>
+                  <pic:cNvPr id="1759897493" name="Graphic 1759897493"/>
+                  <pic:cNvPicPr/>
                 </pic:nvPicPr>
                 <pic:blipFill>
                   <a:blip r:embed="rId1">
@@ -339,46 +358,42 @@
                       <a:ext uri="{28A0092B-C50C-407E-A947-70E740481C1C}">
                         <a14:useLocalDpi xmlns:a14="http://schemas.microsoft.com/office/drawing/2010/main" val="0"/>
                       </a:ext>
+                      <a:ext uri="{96DAC541-7B7A-43D3-8B79-37D633B846F1}">
+                        <asvg:svgBlip xmlns:asvg="http://schemas.microsoft.com/office/drawing/2016/SVG/main" r:embed="rId2"/>
+                      </a:ext>
                     </a:extLst>
                   </a:blip>
-                  <a:srcRect/>
                   <a:stretch>
                     <a:fillRect/>
                   </a:stretch>
                 </pic:blipFill>
-                <pic:spPr bwMode="auto">
+                <pic:spPr>
                   <a:xfrm>
                     <a:off x="0" y="0"/>
-                    <a:ext cx="1774190" cy="1657985"/>
+                    <a:ext cx="3292884" cy="773723"/>
                   </a:xfrm>
                   <a:prstGeom prst="rect">
                     <a:avLst/>
                   </a:prstGeom>
-                  <a:noFill/>
                 </pic:spPr>
               </pic:pic>
             </a:graphicData>
           </a:graphic>
+          <wp14:sizeRelH relativeFrom="margin">
+            <wp14:pctWidth>0</wp14:pctWidth>
+          </wp14:sizeRelH>
+          <wp14:sizeRelV relativeFrom="margin">
+            <wp14:pctHeight>0</wp14:pctHeight>
+          </wp14:sizeRelV>
         </wp:anchor>
       </w:drawing>
     </w:r>
-    <w:r>
-      <w:rPr>
-        <w:sz w:val="72"/>
-      </w:rPr>
-      <w:t>PYRAMIDE IMMOBILIER</w:t>
-    </w:r>
-  </w:p>
-  <w:p>
-    <w:pPr>
-      <w:pStyle w:val="En-tte"/>
-    </w:pPr>
   </w:p>
 </w:hdr>
 </file>
 
 <file path=word/styles.xml><?xml version="1.0" encoding="utf-8"?>
-<w:styles xmlns:mc="http://schemas.openxmlformats.org/markup-compatibility/2006" xmlns:r="http://schemas.openxmlformats.org/officeDocument/2006/relationships" xmlns:w="http://schemas.openxmlformats.org/wordprocessingml/2006/main" xmlns:w14="http://schemas.microsoft.com/office/word/2010/wordml" xmlns:w15="http://schemas.microsoft.com/office/word/2012/wordml" xmlns:w16se="http://schemas.microsoft.com/office/word/2015/wordml/symex" mc:Ignorable="w14 w15 w16se">
+<w:styles xmlns:mc="http://schemas.openxmlformats.org/markup-compatibility/2006" xmlns:r="http://schemas.openxmlformats.org/officeDocument/2006/relationships" xmlns:w="http://schemas.openxmlformats.org/wordprocessingml/2006/main" xmlns:w14="http://schemas.microsoft.com/office/word/2010/wordml" xmlns:w15="http://schemas.microsoft.com/office/word/2012/wordml" xmlns:w16cex="http://schemas.microsoft.com/office/word/2018/wordml/cex" xmlns:w16cid="http://schemas.microsoft.com/office/word/2016/wordml/cid" xmlns:w16="http://schemas.microsoft.com/office/word/2018/wordml" xmlns:w16sdtdh="http://schemas.microsoft.com/office/word/2020/wordml/sdtdatahash" xmlns:w16se="http://schemas.microsoft.com/office/word/2015/wordml/symex" mc:Ignorable="w14 w15 w16se w16cid w16 w16cex w16sdtdh">
   <w:docDefaults>
     <w:rPrDefault>
       <w:rPr>
@@ -394,7 +409,7 @@
       </w:pPr>
     </w:pPrDefault>
   </w:docDefaults>
-  <w:latentStyles w:defLockedState="0" w:defUIPriority="99" w:defSemiHidden="0" w:defUnhideWhenUsed="0" w:defQFormat="0" w:count="371">
+  <w:latentStyles w:defLockedState="0" w:defUIPriority="99" w:defSemiHidden="0" w:defUnhideWhenUsed="0" w:defQFormat="0" w:count="376">
     <w:lsdException w:name="Normal" w:uiPriority="0" w:qFormat="1"/>
     <w:lsdException w:name="heading 1" w:uiPriority="9" w:qFormat="1"/>
     <w:lsdException w:name="heading 2" w:semiHidden="1" w:uiPriority="9" w:unhideWhenUsed="1" w:qFormat="1"/>
@@ -766,18 +781,23 @@
     <w:lsdException w:name="List Table 5 Dark Accent 6" w:uiPriority="50"/>
     <w:lsdException w:name="List Table 6 Colorful Accent 6" w:uiPriority="51"/>
     <w:lsdException w:name="List Table 7 Colorful Accent 6" w:uiPriority="52"/>
+    <w:lsdException w:name="Mention" w:semiHidden="1" w:unhideWhenUsed="1"/>
+    <w:lsdException w:name="Smart Hyperlink" w:semiHidden="1" w:unhideWhenUsed="1"/>
+    <w:lsdException w:name="Hashtag" w:semiHidden="1" w:unhideWhenUsed="1"/>
+    <w:lsdException w:name="Unresolved Mention" w:semiHidden="1" w:unhideWhenUsed="1"/>
+    <w:lsdException w:name="Smart Link" w:semiHidden="1" w:unhideWhenUsed="1"/>
   </w:latentStyles>
   <w:style w:type="paragraph" w:default="1" w:styleId="Normal">
     <w:name w:val="Normal"/>
     <w:qFormat/>
   </w:style>
-  <w:style w:type="character" w:default="1" w:styleId="Policepardfaut">
+  <w:style w:type="character" w:default="1" w:styleId="DefaultParagraphFont">
     <w:name w:val="Default Paragraph Font"/>
     <w:uiPriority w:val="1"/>
     <w:semiHidden/>
     <w:unhideWhenUsed/>
   </w:style>
-  <w:style w:type="table" w:default="1" w:styleId="TableauNormal">
+  <w:style w:type="table" w:default="1" w:styleId="TableNormal">
     <w:name w:val="Normal Table"/>
     <w:uiPriority w:val="99"/>
     <w:semiHidden/>
@@ -792,16 +812,16 @@
       </w:tblCellMar>
     </w:tblPr>
   </w:style>
-  <w:style w:type="numbering" w:default="1" w:styleId="Aucuneliste">
+  <w:style w:type="numbering" w:default="1" w:styleId="NoList">
     <w:name w:val="No List"/>
     <w:uiPriority w:val="99"/>
     <w:semiHidden/>
     <w:unhideWhenUsed/>
   </w:style>
-  <w:style w:type="paragraph" w:styleId="En-tte">
+  <w:style w:type="paragraph" w:styleId="Header">
     <w:name w:val="header"/>
     <w:basedOn w:val="Normal"/>
-    <w:link w:val="En-tteCar"/>
+    <w:link w:val="HeaderChar"/>
     <w:uiPriority w:val="99"/>
     <w:unhideWhenUsed/>
     <w:rsid w:val="00E108C7"/>
@@ -813,17 +833,17 @@
       <w:spacing w:after="0" w:line="240" w:lineRule="auto"/>
     </w:pPr>
   </w:style>
-  <w:style w:type="character" w:customStyle="1" w:styleId="En-tteCar">
-    <w:name w:val="En-tête Car"/>
-    <w:basedOn w:val="Policepardfaut"/>
-    <w:link w:val="En-tte"/>
+  <w:style w:type="character" w:customStyle="1" w:styleId="HeaderChar">
+    <w:name w:val="Header Char"/>
+    <w:basedOn w:val="DefaultParagraphFont"/>
+    <w:link w:val="Header"/>
     <w:uiPriority w:val="99"/>
     <w:rsid w:val="00E108C7"/>
   </w:style>
-  <w:style w:type="paragraph" w:styleId="Pieddepage">
+  <w:style w:type="paragraph" w:styleId="Footer">
     <w:name w:val="footer"/>
     <w:basedOn w:val="Normal"/>
-    <w:link w:val="PieddepageCar"/>
+    <w:link w:val="FooterChar"/>
     <w:uiPriority w:val="99"/>
     <w:unhideWhenUsed/>
     <w:rsid w:val="00E108C7"/>
@@ -835,16 +855,16 @@
       <w:spacing w:after="0" w:line="240" w:lineRule="auto"/>
     </w:pPr>
   </w:style>
-  <w:style w:type="character" w:customStyle="1" w:styleId="PieddepageCar">
-    <w:name w:val="Pied de page Car"/>
-    <w:basedOn w:val="Policepardfaut"/>
-    <w:link w:val="Pieddepage"/>
+  <w:style w:type="character" w:customStyle="1" w:styleId="FooterChar">
+    <w:name w:val="Footer Char"/>
+    <w:basedOn w:val="DefaultParagraphFont"/>
+    <w:link w:val="Footer"/>
     <w:uiPriority w:val="99"/>
     <w:rsid w:val="00E108C7"/>
   </w:style>
-  <w:style w:type="table" w:styleId="Grilledutableau">
+  <w:style w:type="table" w:styleId="TableGrid">
     <w:name w:val="Table Grid"/>
-    <w:basedOn w:val="TableauNormal"/>
+    <w:basedOn w:val="TableNormal"/>
     <w:uiPriority w:val="39"/>
     <w:rsid w:val="00E108C7"/>
     <w:pPr>
@@ -861,10 +881,10 @@
       </w:tblBorders>
     </w:tblPr>
   </w:style>
-  <w:style w:type="paragraph" w:styleId="Textedebulles">
+  <w:style w:type="paragraph" w:styleId="BalloonText">
     <w:name w:val="Balloon Text"/>
     <w:basedOn w:val="Normal"/>
-    <w:link w:val="TextedebullesCar"/>
+    <w:link w:val="BalloonTextChar"/>
     <w:uiPriority w:val="99"/>
     <w:semiHidden/>
     <w:unhideWhenUsed/>
@@ -878,10 +898,10 @@
       <w:szCs w:val="18"/>
     </w:rPr>
   </w:style>
-  <w:style w:type="character" w:customStyle="1" w:styleId="TextedebullesCar">
-    <w:name w:val="Texte de bulles Car"/>
-    <w:basedOn w:val="Policepardfaut"/>
-    <w:link w:val="Textedebulles"/>
+  <w:style w:type="character" w:customStyle="1" w:styleId="BalloonTextChar">
+    <w:name w:val="Balloon Text Char"/>
+    <w:basedOn w:val="DefaultParagraphFont"/>
+    <w:link w:val="BalloonText"/>
     <w:uiPriority w:val="99"/>
     <w:semiHidden/>
     <w:rsid w:val="001F3C61"/>
@@ -889,6 +909,40 @@
       <w:rFonts w:ascii="Segoe UI" w:hAnsi="Segoe UI" w:cs="Segoe UI"/>
       <w:sz w:val="18"/>
       <w:szCs w:val="18"/>
+    </w:rPr>
+  </w:style>
+  <w:style w:type="paragraph" w:styleId="Title">
+    <w:name w:val="Title"/>
+    <w:basedOn w:val="Normal"/>
+    <w:next w:val="Normal"/>
+    <w:link w:val="TitleChar"/>
+    <w:uiPriority w:val="10"/>
+    <w:qFormat/>
+    <w:rsid w:val="00DC34C4"/>
+    <w:pPr>
+      <w:spacing w:after="0" w:line="240" w:lineRule="auto"/>
+      <w:contextualSpacing/>
+    </w:pPr>
+    <w:rPr>
+      <w:rFonts w:asciiTheme="majorHAnsi" w:eastAsiaTheme="majorEastAsia" w:hAnsiTheme="majorHAnsi" w:cstheme="majorBidi"/>
+      <w:spacing w:val="-10"/>
+      <w:kern w:val="28"/>
+      <w:sz w:val="56"/>
+      <w:szCs w:val="56"/>
+    </w:rPr>
+  </w:style>
+  <w:style w:type="character" w:customStyle="1" w:styleId="TitleChar">
+    <w:name w:val="Title Char"/>
+    <w:basedOn w:val="DefaultParagraphFont"/>
+    <w:link w:val="Title"/>
+    <w:uiPriority w:val="10"/>
+    <w:rsid w:val="00DC34C4"/>
+    <w:rPr>
+      <w:rFonts w:asciiTheme="majorHAnsi" w:eastAsiaTheme="majorEastAsia" w:hAnsiTheme="majorHAnsi" w:cstheme="majorBidi"/>
+      <w:spacing w:val="-10"/>
+      <w:kern w:val="28"/>
+      <w:sz w:val="56"/>
+      <w:szCs w:val="56"/>
     </w:rPr>
   </w:style>
 </w:styles>

</xml_diff>

<commit_message>
Listings ReferenceCode Added & Privacy + Terms added
</commit_message>
<xml_diff>
--- a/public/templates/Bon de Paiement Frais d'agence.docx
+++ b/public/templates/Bon de Paiement Frais d'agence.docx
@@ -36,19 +36,45 @@
     </w:p>
     <w:p/>
     <w:p>
-      <w:r>
-        <w:t xml:space="preserve">Reference : </w:t>
-      </w:r>
-      <w:r>
-        <w:t>{{RECEIPT_NUMBER}}</w:t>
-      </w:r>
-    </w:p>
-    <w:p>
-      <w:r>
-        <w:t xml:space="preserve">Date : </w:t>
-      </w:r>
-      <w:r>
-        <w:t>{{DATE}}</w:t>
+      <w:pPr>
+        <w:rPr>
+          <w:lang w:val="en-US"/>
+        </w:rPr>
+      </w:pPr>
+      <w:proofErr w:type="gramStart"/>
+      <w:r>
+        <w:rPr>
+          <w:lang w:val="en-US"/>
+        </w:rPr>
+        <w:t>Reference :</w:t>
+      </w:r>
+      <w:proofErr w:type="gramEnd"/>
+      <w:r>
+        <w:rPr>
+          <w:lang w:val="en-US"/>
+        </w:rPr>
+        <w:t xml:space="preserve"> {{RECEIPT_NUMBER}}</w:t>
+      </w:r>
+    </w:p>
+    <w:p>
+      <w:pPr>
+        <w:rPr>
+          <w:lang w:val="en-US"/>
+        </w:rPr>
+      </w:pPr>
+      <w:proofErr w:type="gramStart"/>
+      <w:r>
+        <w:rPr>
+          <w:lang w:val="en-US"/>
+        </w:rPr>
+        <w:t>Date :</w:t>
+      </w:r>
+      <w:proofErr w:type="gramEnd"/>
+      <w:r>
+        <w:rPr>
+          <w:lang w:val="en-US"/>
+        </w:rPr>
+        <w:t xml:space="preserve"> {{DATE}}</w:t>
       </w:r>
     </w:p>
     <w:p>
@@ -78,7 +104,13 @@
         <w:t xml:space="preserve">: </w:t>
       </w:r>
       <w:r>
-        <w:t>{{PROPERTY_ADDRESS}}</w:t>
+        <w:t>{{</w:t>
+      </w:r>
+      <w:r>
+        <w:t>CLIENT</w:t>
+      </w:r>
+      <w:r>
+        <w:t>_ADDRESS}}</w:t>
       </w:r>
     </w:p>
     <w:p>
@@ -103,25 +135,93 @@
     </w:p>
     <w:p/>
     <w:p>
-      <w:r>
-        <w:t>Type d’appartement :</w:t>
-      </w:r>
-      <w:r>
+      <w:pPr>
+        <w:rPr>
+          <w:lang w:val="en-US"/>
+        </w:rPr>
+      </w:pPr>
+      <w:r>
+        <w:rPr>
+          <w:lang w:val="en-US"/>
+        </w:rPr>
+        <w:t xml:space="preserve">Type </w:t>
+      </w:r>
+      <w:proofErr w:type="spellStart"/>
+      <w:proofErr w:type="gramStart"/>
+      <w:r>
+        <w:rPr>
+          <w:lang w:val="en-US"/>
+        </w:rPr>
+        <w:t>d’appartement</w:t>
+      </w:r>
+      <w:proofErr w:type="spellEnd"/>
+      <w:r>
+        <w:rPr>
+          <w:lang w:val="en-US"/>
+        </w:rPr>
+        <w:t> :</w:t>
+      </w:r>
+      <w:proofErr w:type="gramEnd"/>
+      <w:r>
+        <w:rPr>
+          <w:lang w:val="en-US"/>
+        </w:rPr>
+        <w:t xml:space="preserve"> {{PROPERTY_TYPE}}</w:t>
+      </w:r>
+    </w:p>
+    <w:p>
+      <w:pPr>
+        <w:rPr>
+          <w:lang w:val="en-US"/>
+        </w:rPr>
+      </w:pPr>
+      <w:proofErr w:type="gramStart"/>
+      <w:r>
+        <w:rPr>
+          <w:lang w:val="en-US"/>
+        </w:rPr>
+        <w:t>Prix :</w:t>
+      </w:r>
+      <w:proofErr w:type="gramEnd"/>
+      <w:r>
+        <w:rPr>
+          <w:lang w:val="en-US"/>
+        </w:rPr>
         <w:t xml:space="preserve"> </w:t>
       </w:r>
       <w:r>
-        <w:t>{{PROPERTY_TYPE}}</w:t>
-      </w:r>
-    </w:p>
-    <w:p>
-      <w:r>
-        <w:t xml:space="preserve">Prix : </w:t>
-      </w:r>
-      <w:r>
+        <w:rPr>
+          <w:lang w:val="en-US"/>
+        </w:rPr>
+        <w:t>{{AMOUNT}}</w:t>
+      </w:r>
+      <w:r>
+        <w:rPr>
+          <w:lang w:val="en-US"/>
+        </w:rPr>
+        <w:t xml:space="preserve"> </w:t>
+      </w:r>
+    </w:p>
+    <w:p>
+      <w:pPr>
+        <w:rPr>
+          <w:lang w:val="en-US"/>
+        </w:rPr>
+      </w:pPr>
+      <w:r>
+        <w:rPr>
+          <w:lang w:val="en-US"/>
+        </w:rPr>
         <w:t>{{AMOUNT_WORDS}}</w:t>
       </w:r>
     </w:p>
-    <w:p/>
+    <w:p>
+      <w:pPr>
+        <w:rPr>
+          <w:lang w:val="en-US"/>
+        </w:rPr>
+      </w:pPr>
+    </w:p>
     <w:p>
       <w:pPr>
         <w:rPr>

</xml_diff>